<commit_message>
✅ Removing auto fill
</commit_message>
<xml_diff>
--- a/LEMBAR_NOTADINAS.docx
+++ b/LEMBAR_NOTADINAS.docx
@@ -676,7 +676,31 @@
           <w:lang w:val="sv-SE"/>
         </w:rPr>
         <w:tab/>
-        <w:t>Untuk melaksanakan koordinasi dan peliputan kegiatan tersebut pada tanggal {assignments - date} di {assignments – location_detail}</w:t>
+        <w:t xml:space="preserve">Untuk melaksanakan koordinasi dan peliputan kegiatan tersebut pada tanggal </w:t>
+      </w:r>
+      <w:r>
+        <w:rPr>
+          <w:sz w:val="20"/>
+          <w:szCs w:val="20"/>
+          <w:lang w:val="sv-SE"/>
+        </w:rPr>
+        <w:t>{assignments - date} s/d {assignments – date} + {assignments – day_count - 1} {years - now()}</w:t>
+      </w:r>
+      <w:r>
+        <w:rPr>
+          <w:sz w:val="20"/>
+          <w:szCs w:val="20"/>
+          <w:lang w:val="sv-SE"/>
+        </w:rPr>
+        <w:t xml:space="preserve"> </w:t>
+      </w:r>
+      <w:r>
+        <w:rPr>
+          <w:sz w:val="22"/>
+          <w:szCs w:val="20"/>
+          <w:lang w:val="sv-SE"/>
+        </w:rPr>
+        <w:t>di {assignments – location_detail}</w:t>
       </w:r>
       <w:r>
         <w:rPr>
@@ -718,7 +742,39 @@
           <w:szCs w:val="20"/>
           <w:lang w:val="sv-SE"/>
         </w:rPr>
-        <w:t xml:space="preserve">Dana untuk kegiatan tersebut dibebankan pada Dokumen Pelaksanaan Anggaran Satuan Perangkat DPA Biro Administrasi Pimpinan Tahun Anggaran </w:t>
+        <w:t xml:space="preserve">Dana untuk kegiatan tersebut dibebankan pada Dokumen Pelaksanaan Anggaran Satuan Perangkat </w:t>
+      </w:r>
+      <w:r>
+        <w:rPr>
+          <w:sz w:val="22"/>
+          <w:szCs w:val="20"/>
+          <w:lang w:val="sv-SE"/>
+        </w:rPr>
+        <w:t xml:space="preserve">Daerah </w:t>
+      </w:r>
+      <w:r>
+        <w:rPr>
+          <w:sz w:val="22"/>
+          <w:szCs w:val="20"/>
+          <w:lang w:val="sv-SE"/>
+        </w:rPr>
+        <w:t>DPA</w:t>
+      </w:r>
+      <w:r>
+        <w:rPr>
+          <w:sz w:val="22"/>
+          <w:szCs w:val="20"/>
+          <w:lang w:val="sv-SE"/>
+        </w:rPr>
+        <w:t xml:space="preserve"> Nomor : DPA/A.1/4.01.0.00.0.00.01/2026 Tanggal 31 Desember 2025</w:t>
+      </w:r>
+      <w:r>
+        <w:rPr>
+          <w:sz w:val="22"/>
+          <w:szCs w:val="20"/>
+          <w:lang w:val="sv-SE"/>
+        </w:rPr>
+        <w:t xml:space="preserve"> Biro Administrasi Pimpinan Tahun Anggaran </w:t>
       </w:r>
       <w:r>
         <w:rPr>

</xml_diff>